<commit_message>
fix(itau): replace 3d with architecture notation
</commit_message>
<xml_diff>
--- a/docs/itau/itau-ai-governance-architecture-reference.docx
+++ b/docs/itau/itau-ai-governance-architecture-reference.docx
@@ -29,7 +29,7 @@
           <w:sz w:val="50"/>
           <w:szCs w:val="50"/>
         </w:rPr>
-        <w:t xml:space="preserve">ServiceNow CSDM Architecture Blueprint</w:t>
+        <w:t xml:space="preserve">ServiceNow Architectural Notation &amp; Target Architecture</w:t>
       </w:r>
     </w:p>
     <w:p>
@@ -42,7 +42,7 @@
           <w:sz w:val="24"/>
           <w:szCs w:val="24"/>
         </w:rPr>
-        <w:t xml:space="preserve">Reference Pack para alinhar Squad Gaia, Arquitetura, CMDB Owner e Governança: o problema não é escolher uma tabela, é desenhar onde cada agente vive, quem responde, qual serviço ele impacta e como AI Control Tower opera descoberta, risco e lifecycle.</w:t>
+        <w:t xml:space="preserve">Reference Pack para alinhar Squad Gaia, Arquitetura, CMDB Owner e Governança: o problema não é escolher uma tabela nem criar um efeito visual; é consolidar decisões de arquitetura sobre onde cada agente vive, quem responde, qual serviço ele impacta e como AI Control Tower opera descoberta, risco, runtime e lifecycle.</w:t>
       </w:r>
     </w:p>
     <w:tbl>
@@ -108,7 +108,7 @@
                 <w:sz w:val="20"/>
                 <w:szCs w:val="20"/>
               </w:rPr>
-              <w:t xml:space="preserve">Architecture Blueprint, não cadastro de tabela.</w:t>
+              <w:t xml:space="preserve">Architectural Notation, não showcase 3D.</w:t>
             </w:r>
           </w:p>
         </w:tc>
@@ -162,7 +162,7 @@
                 <w:sz w:val="19"/>
                 <w:szCs w:val="19"/>
               </w:rPr>
-              <w:t xml:space="preserve">Architecture Sprint com 3 a 5 agentes reais antes de carga em escala.</w:t>
+              <w:t xml:space="preserve">Visão final: CSDM como sistema de registro; AI Control Tower como sistema de controle.</w:t>
             </w:r>
           </w:p>
         </w:tc>
@@ -252,7 +252,7 @@
           <w:sz w:val="22"/>
           <w:szCs w:val="22"/>
         </w:rPr>
-        <w:t xml:space="preserve">O Itaú não precisa apenas registrar agentes de IA. Precisa de um blueprint para governar ativo, runtime, serviço impactado, dados, ownership e mudança. Isso preserva CSDM, evita CMDB decorativa e prepara discovery enterprise via AI Control Tower.</w:t>
+        <w:t xml:space="preserve">O Itaú não precisa apenas registrar agentes de IA. Precisa de um blueprint para governar ativo, runtime, serviço impactado, dados, ownership e mudança. Isso preserva CSDM, evita CMDB decorativa e prepara discovery enterprise via AI Control Tower. A forma correta de apresentação é notação arquitetural: camadas, decisões, owners e relações, não uma visualização 3D difícil de explicar em reunião.</w:t>
       </w:r>
     </w:p>
     <w:tbl>
@@ -611,7 +611,7 @@
           <w:sz w:val="34"/>
           <w:szCs w:val="34"/>
         </w:rPr>
-        <w:t xml:space="preserve">2. ServiceNow CSDM Reference Diagram</w:t>
+        <w:t xml:space="preserve">2. ServiceNow Architectural Notation</w:t>
       </w:r>
     </w:p>
     <w:p>
@@ -1420,7 +1420,7 @@
           <w:sz w:val="34"/>
           <w:szCs w:val="34"/>
         </w:rPr>
-        <w:t xml:space="preserve">3. Modelo de Dados Mínimo</w:t>
+        <w:t xml:space="preserve">3. Target Architecture + AI Control Tower Operating Model</w:t>
       </w:r>
     </w:p>
     <w:tbl>
@@ -1459,7 +1459,7 @@
                 <w:sz w:val="20"/>
                 <w:szCs w:val="20"/>
               </w:rPr>
-              <w:t xml:space="preserve">Grupo</w:t>
+              <w:t xml:space="preserve">Decisão</w:t>
             </w:r>
           </w:p>
         </w:tc>
@@ -1486,7 +1486,7 @@
                 <w:sz w:val="20"/>
                 <w:szCs w:val="20"/>
               </w:rPr>
-              <w:t xml:space="preserve">Campos mínimos</w:t>
+              <w:t xml:space="preserve">Arquitetura consolidada</w:t>
             </w:r>
           </w:p>
         </w:tc>
@@ -1514,7 +1514,7 @@
                 <w:sz w:val="19"/>
                 <w:szCs w:val="19"/>
               </w:rPr>
-              <w:t xml:space="preserve">Accountability</w:t>
+              <w:t xml:space="preserve">Sistema de registro</w:t>
             </w:r>
           </w:p>
         </w:tc>
@@ -1540,7 +1540,7 @@
                 <w:sz w:val="19"/>
                 <w:szCs w:val="19"/>
               </w:rPr>
-              <w:t xml:space="preserve">business_owner, technical_owner, support_group, data_steward, risk_owner</w:t>
+              <w:t xml:space="preserve">CMDB/CSDM continua sendo a base de impacto, serviço, relacionamento e operação.</w:t>
             </w:r>
           </w:p>
         </w:tc>
@@ -1568,7 +1568,7 @@
                 <w:sz w:val="19"/>
                 <w:szCs w:val="19"/>
               </w:rPr>
-              <w:t xml:space="preserve">Risco e dado</w:t>
+              <w:t xml:space="preserve">Sistema de controle</w:t>
             </w:r>
           </w:p>
         </w:tc>
@@ -1594,7 +1594,7 @@
                 <w:sz w:val="19"/>
                 <w:szCs w:val="19"/>
               </w:rPr>
-              <w:t xml:space="preserve">risk_tier, data_classification, pii_handling, data_residency, decision_authority</w:t>
+              <w:t xml:space="preserve">AI Control Tower governa inventário, descoberta, risco, runtime, valor e workflows.</w:t>
             </w:r>
           </w:p>
         </w:tc>
@@ -1622,7 +1622,7 @@
                 <w:sz w:val="19"/>
                 <w:szCs w:val="19"/>
               </w:rPr>
-              <w:t xml:space="preserve">Runtime</w:t>
+              <w:t xml:space="preserve">Regra de CI</w:t>
             </w:r>
           </w:p>
         </w:tc>
@@ -1648,7 +1648,7 @@
                 <w:sz w:val="19"/>
                 <w:szCs w:val="19"/>
               </w:rPr>
-              <w:t xml:space="preserve">hosting_model, provider, environment, external_id, source_unique_id</w:t>
+              <w:t xml:space="preserve">Sem deployment visível não há CI operacional; com deployment, classe depende do hosting model.</w:t>
             </w:r>
           </w:p>
         </w:tc>
@@ -1676,7 +1676,7 @@
                 <w:sz w:val="19"/>
                 <w:szCs w:val="19"/>
               </w:rPr>
-              <w:t xml:space="preserve">Governança</w:t>
+              <w:t xml:space="preserve">Correlação</w:t>
             </w:r>
           </w:p>
         </w:tc>
@@ -1702,7 +1702,118 @@
                 <w:sz w:val="19"/>
                 <w:szCs w:val="19"/>
               </w:rPr>
-              <w:t xml:space="preserve">review_cadence, kill_switch_owner, lifecycle, approval_state, evidence_url</w:t>
+              <w:t xml:space="preserve">source_unique_id/external_id é obrigatório para reconciliar runtime, CMDB e AICT.</w:t>
+            </w:r>
+          </w:p>
+        </w:tc>
+      </w:tr>
+    </w:tbl>
+    <w:p>
+      <w:pPr>
+        <w:pStyle w:val="Heading2"/>
+        <w:spacing w:before="80" w:after="120"/>
+      </w:pPr>
+      <w:r>
+        <w:rPr>
+          <w:b/>
+          <w:color w:val="EC7000"/>
+          <w:sz w:val="24"/>
+          <w:szCs w:val="24"/>
+        </w:rPr>
+        <w:t xml:space="preserve">Operating model para sustentar AI Control Tower.</w:t>
+      </w:r>
+    </w:p>
+    <w:tbl>
+      <w:tblPr>
+        <w:tblW w:w="0" w:type="auto"/>
+        <w:tblBorders>
+          <w:top w:val="single" w:sz="6" w:color="D8DEE8"/>
+          <w:left w:val="single" w:sz="6" w:color="D8DEE8"/>
+          <w:bottom w:val="single" w:sz="6" w:color="D8DEE8"/>
+          <w:right w:val="single" w:sz="6" w:color="D8DEE8"/>
+          <w:insideH w:val="single" w:sz="4" w:color="D8DEE8"/>
+          <w:insideV w:val="single" w:sz="4" w:color="D8DEE8"/>
+        </w:tblBorders>
+      </w:tblPr>
+      <w:tr>
+        <w:tc>
+          <w:tcPr>
+            <w:tcW w:w="2200" w:type="dxa"/>
+            <w:shd w:fill="F2F5F9"/>
+            <w:tcMar>
+              <w:top w:w="120" w:type="dxa"/>
+              <w:left w:w="120" w:type="dxa"/>
+              <w:bottom w:w="120" w:type="dxa"/>
+              <w:right w:w="120" w:type="dxa"/>
+            </w:tcMar>
+          </w:tcPr>
+          <w:p>
+            <w:pPr>
+              <w:pStyle w:val="BodyText"/>
+              <w:spacing w:before="0" w:after="0"/>
+            </w:pPr>
+            <w:r>
+              <w:rPr>
+                <w:b/>
+                <w:color w:val="162033"/>
+                <w:sz w:val="20"/>
+                <w:szCs w:val="20"/>
+              </w:rPr>
+              <w:t xml:space="preserve">Fase</w:t>
+            </w:r>
+          </w:p>
+        </w:tc>
+        <w:tc>
+          <w:tcPr>
+            <w:tcW w:w="2200" w:type="dxa"/>
+            <w:shd w:fill="F2F5F9"/>
+            <w:tcMar>
+              <w:top w:w="120" w:type="dxa"/>
+              <w:left w:w="120" w:type="dxa"/>
+              <w:bottom w:w="120" w:type="dxa"/>
+              <w:right w:w="120" w:type="dxa"/>
+            </w:tcMar>
+          </w:tcPr>
+          <w:p>
+            <w:pPr>
+              <w:pStyle w:val="BodyText"/>
+              <w:spacing w:before="0" w:after="0"/>
+            </w:pPr>
+            <w:r>
+              <w:rPr>
+                <w:b/>
+                <w:color w:val="162033"/>
+                <w:sz w:val="20"/>
+                <w:szCs w:val="20"/>
+              </w:rPr>
+              <w:t xml:space="preserve">Entrada</w:t>
+            </w:r>
+          </w:p>
+        </w:tc>
+        <w:tc>
+          <w:tcPr>
+            <w:tcW w:w="2200" w:type="dxa"/>
+            <w:shd w:fill="F2F5F9"/>
+            <w:tcMar>
+              <w:top w:w="120" w:type="dxa"/>
+              <w:left w:w="120" w:type="dxa"/>
+              <w:bottom w:w="120" w:type="dxa"/>
+              <w:right w:w="120" w:type="dxa"/>
+            </w:tcMar>
+          </w:tcPr>
+          <w:p>
+            <w:pPr>
+              <w:pStyle w:val="BodyText"/>
+              <w:spacing w:before="0" w:after="0"/>
+            </w:pPr>
+            <w:r>
+              <w:rPr>
+                <w:b/>
+                <w:color w:val="162033"/>
+                <w:sz w:val="20"/>
+                <w:szCs w:val="20"/>
+              </w:rPr>
+              <w:t xml:space="preserve">Saída governada</w:t>
             </w:r>
           </w:p>
         </w:tc>
@@ -1730,7 +1841,7 @@
                 <w:sz w:val="19"/>
                 <w:szCs w:val="19"/>
               </w:rPr>
-              <w:t xml:space="preserve">Relações</w:t>
+              <w:t xml:space="preserve">Discover</w:t>
             </w:r>
           </w:p>
         </w:tc>
@@ -1756,7 +1867,273 @@
                 <w:sz w:val="19"/>
                 <w:szCs w:val="19"/>
               </w:rPr>
-              <w:t xml:space="preserve">cmdb_rel_asset_ci, Service Instance, Business Application, dependencies</w:t>
+              <w:t xml:space="preserve">Service Graph Connectors, Now Assist, hyperscalers, SaaS e esteira Itaú</w:t>
+            </w:r>
+          </w:p>
+        </w:tc>
+        <w:tc>
+          <w:tcPr>
+            <w:tcW w:w="2200" w:type="dxa"/>
+            <w:shd w:fill="F2FBF6"/>
+            <w:tcMar>
+              <w:top w:w="120" w:type="dxa"/>
+              <w:left w:w="120" w:type="dxa"/>
+              <w:bottom w:w="120" w:type="dxa"/>
+              <w:right w:w="120" w:type="dxa"/>
+            </w:tcMar>
+          </w:tcPr>
+          <w:p>
+            <w:pPr>
+              <w:pStyle w:val="BodyText"/>
+              <w:spacing w:before="0" w:after="0"/>
+            </w:pPr>
+            <w:r>
+              <w:rPr>
+                <w:color w:val="283342"/>
+                <w:sz w:val="19"/>
+                <w:szCs w:val="19"/>
+              </w:rPr>
+              <w:t xml:space="preserve">AI systems, agents, models, prompts, datasets, tools e MCP servers entram no inventário.</w:t>
+            </w:r>
+          </w:p>
+        </w:tc>
+      </w:tr>
+      <w:tr>
+        <w:tc>
+          <w:tcPr>
+            <w:tcW w:w="2200" w:type="dxa"/>
+            <w:shd w:fill="F6FAFF"/>
+            <w:tcMar>
+              <w:top w:w="120" w:type="dxa"/>
+              <w:left w:w="120" w:type="dxa"/>
+              <w:bottom w:w="120" w:type="dxa"/>
+              <w:right w:w="120" w:type="dxa"/>
+            </w:tcMar>
+          </w:tcPr>
+          <w:p>
+            <w:pPr>
+              <w:pStyle w:val="BodyText"/>
+              <w:spacing w:before="0" w:after="0"/>
+            </w:pPr>
+            <w:r>
+              <w:rPr>
+                <w:color w:val="283342"/>
+                <w:sz w:val="19"/>
+                <w:szCs w:val="19"/>
+              </w:rPr>
+              <w:t xml:space="preserve">Govern</w:t>
+            </w:r>
+          </w:p>
+        </w:tc>
+        <w:tc>
+          <w:tcPr>
+            <w:tcW w:w="2200" w:type="dxa"/>
+            <w:shd w:fill="FFF7ED"/>
+            <w:tcMar>
+              <w:top w:w="120" w:type="dxa"/>
+              <w:left w:w="120" w:type="dxa"/>
+              <w:bottom w:w="120" w:type="dxa"/>
+              <w:right w:w="120" w:type="dxa"/>
+            </w:tcMar>
+          </w:tcPr>
+          <w:p>
+            <w:pPr>
+              <w:pStyle w:val="BodyText"/>
+              <w:spacing w:before="0" w:after="0"/>
+            </w:pPr>
+            <w:r>
+              <w:rPr>
+                <w:color w:val="283342"/>
+                <w:sz w:val="19"/>
+                <w:szCs w:val="19"/>
+              </w:rPr>
+              <w:t xml:space="preserve">Owner, risco, dados, lifecycle, approval state e managed/unmanaged</w:t>
+            </w:r>
+          </w:p>
+        </w:tc>
+        <w:tc>
+          <w:tcPr>
+            <w:tcW w:w="2200" w:type="dxa"/>
+            <w:shd w:fill="F2FBF6"/>
+            <w:tcMar>
+              <w:top w:w="120" w:type="dxa"/>
+              <w:left w:w="120" w:type="dxa"/>
+              <w:bottom w:w="120" w:type="dxa"/>
+              <w:right w:w="120" w:type="dxa"/>
+            </w:tcMar>
+          </w:tcPr>
+          <w:p>
+            <w:pPr>
+              <w:pStyle w:val="BodyText"/>
+              <w:spacing w:before="0" w:after="0"/>
+            </w:pPr>
+            <w:r>
+              <w:rPr>
+                <w:color w:val="283342"/>
+                <w:sz w:val="19"/>
+                <w:szCs w:val="19"/>
+              </w:rPr>
+              <w:t xml:space="preserve">Steward review e política de governança deixam de ser planilha.</w:t>
+            </w:r>
+          </w:p>
+        </w:tc>
+      </w:tr>
+      <w:tr>
+        <w:tc>
+          <w:tcPr>
+            <w:tcW w:w="2200" w:type="dxa"/>
+            <w:shd w:fill="F6FAFF"/>
+            <w:tcMar>
+              <w:top w:w="120" w:type="dxa"/>
+              <w:left w:w="120" w:type="dxa"/>
+              <w:bottom w:w="120" w:type="dxa"/>
+              <w:right w:w="120" w:type="dxa"/>
+            </w:tcMar>
+          </w:tcPr>
+          <w:p>
+            <w:pPr>
+              <w:pStyle w:val="BodyText"/>
+              <w:spacing w:before="0" w:after="0"/>
+            </w:pPr>
+            <w:r>
+              <w:rPr>
+                <w:color w:val="283342"/>
+                <w:sz w:val="19"/>
+                <w:szCs w:val="19"/>
+              </w:rPr>
+              <w:t xml:space="preserve">Relate</w:t>
+            </w:r>
+          </w:p>
+        </w:tc>
+        <w:tc>
+          <w:tcPr>
+            <w:tcW w:w="2200" w:type="dxa"/>
+            <w:shd w:fill="FFF7ED"/>
+            <w:tcMar>
+              <w:top w:w="120" w:type="dxa"/>
+              <w:left w:w="120" w:type="dxa"/>
+              <w:bottom w:w="120" w:type="dxa"/>
+              <w:right w:w="120" w:type="dxa"/>
+            </w:tcMar>
+          </w:tcPr>
+          <w:p>
+            <w:pPr>
+              <w:pStyle w:val="BodyText"/>
+              <w:spacing w:before="0" w:after="0"/>
+            </w:pPr>
+            <w:r>
+              <w:rPr>
+                <w:color w:val="283342"/>
+                <w:sz w:val="19"/>
+                <w:szCs w:val="19"/>
+              </w:rPr>
+              <w:t xml:space="preserve">cmdb_rel_asset_ci, Service Instance, Business Application e source_unique_id</w:t>
+            </w:r>
+          </w:p>
+        </w:tc>
+        <w:tc>
+          <w:tcPr>
+            <w:tcW w:w="2200" w:type="dxa"/>
+            <w:shd w:fill="F2FBF6"/>
+            <w:tcMar>
+              <w:top w:w="120" w:type="dxa"/>
+              <w:left w:w="120" w:type="dxa"/>
+              <w:bottom w:w="120" w:type="dxa"/>
+              <w:right w:w="120" w:type="dxa"/>
+            </w:tcMar>
+          </w:tcPr>
+          <w:p>
+            <w:pPr>
+              <w:pStyle w:val="BodyText"/>
+              <w:spacing w:before="0" w:after="0"/>
+            </w:pPr>
+            <w:r>
+              <w:rPr>
+                <w:color w:val="283342"/>
+                <w:sz w:val="19"/>
+                <w:szCs w:val="19"/>
+              </w:rPr>
+              <w:t xml:space="preserve">AI asset, CI, serviço e runtime ficam reconciliáveis por IRE e auditáveis.</w:t>
+            </w:r>
+          </w:p>
+        </w:tc>
+      </w:tr>
+      <w:tr>
+        <w:tc>
+          <w:tcPr>
+            <w:tcW w:w="2200" w:type="dxa"/>
+            <w:shd w:fill="F6FAFF"/>
+            <w:tcMar>
+              <w:top w:w="120" w:type="dxa"/>
+              <w:left w:w="120" w:type="dxa"/>
+              <w:bottom w:w="120" w:type="dxa"/>
+              <w:right w:w="120" w:type="dxa"/>
+            </w:tcMar>
+          </w:tcPr>
+          <w:p>
+            <w:pPr>
+              <w:pStyle w:val="BodyText"/>
+              <w:spacing w:before="0" w:after="0"/>
+            </w:pPr>
+            <w:r>
+              <w:rPr>
+                <w:color w:val="283342"/>
+                <w:sz w:val="19"/>
+                <w:szCs w:val="19"/>
+              </w:rPr>
+              <w:t xml:space="preserve">Act</w:t>
+            </w:r>
+          </w:p>
+        </w:tc>
+        <w:tc>
+          <w:tcPr>
+            <w:tcW w:w="2200" w:type="dxa"/>
+            <w:shd w:fill="FFF7ED"/>
+            <w:tcMar>
+              <w:top w:w="120" w:type="dxa"/>
+              <w:left w:w="120" w:type="dxa"/>
+              <w:bottom w:w="120" w:type="dxa"/>
+              <w:right w:w="120" w:type="dxa"/>
+            </w:tcMar>
+          </w:tcPr>
+          <w:p>
+            <w:pPr>
+              <w:pStyle w:val="BodyText"/>
+              <w:spacing w:before="0" w:after="0"/>
+            </w:pPr>
+            <w:r>
+              <w:rPr>
+                <w:color w:val="283342"/>
+                <w:sz w:val="19"/>
+                <w:szCs w:val="19"/>
+              </w:rPr>
+              <w:t xml:space="preserve">Mudança de modelo, prompt, permissão, dataset, postura ou runtime</w:t>
+            </w:r>
+          </w:p>
+        </w:tc>
+        <w:tc>
+          <w:tcPr>
+            <w:tcW w:w="2200" w:type="dxa"/>
+            <w:shd w:fill="F2FBF6"/>
+            <w:tcMar>
+              <w:top w:w="120" w:type="dxa"/>
+              <w:left w:w="120" w:type="dxa"/>
+              <w:bottom w:w="120" w:type="dxa"/>
+              <w:right w:w="120" w:type="dxa"/>
+            </w:tcMar>
+          </w:tcPr>
+          <w:p>
+            <w:pPr>
+              <w:pStyle w:val="BodyText"/>
+              <w:spacing w:before="0" w:after="0"/>
+            </w:pPr>
+            <w:r>
+              <w:rPr>
+                <w:color w:val="283342"/>
+                <w:sz w:val="19"/>
+                <w:szCs w:val="19"/>
+              </w:rPr>
+              <w:t xml:space="preserve">Change, remediation, recertificação, exceção, kill switch ou decommission.</w:t>
             </w:r>
           </w:p>
         </w:tc>
@@ -1779,7 +2156,366 @@
           <w:sz w:val="34"/>
           <w:szCs w:val="34"/>
         </w:rPr>
-        <w:t xml:space="preserve">4. Architecture Sprint</w:t>
+        <w:t xml:space="preserve">4. Modelo de Dados Mínimo</w:t>
+      </w:r>
+    </w:p>
+    <w:tbl>
+      <w:tblPr>
+        <w:tblW w:w="0" w:type="auto"/>
+        <w:tblBorders>
+          <w:top w:val="single" w:sz="6" w:color="D8DEE8"/>
+          <w:left w:val="single" w:sz="6" w:color="D8DEE8"/>
+          <w:bottom w:val="single" w:sz="6" w:color="D8DEE8"/>
+          <w:right w:val="single" w:sz="6" w:color="D8DEE8"/>
+          <w:insideH w:val="single" w:sz="4" w:color="D8DEE8"/>
+          <w:insideV w:val="single" w:sz="4" w:color="D8DEE8"/>
+        </w:tblBorders>
+      </w:tblPr>
+      <w:tr>
+        <w:tc>
+          <w:tcPr>
+            <w:tcW w:w="2200" w:type="dxa"/>
+            <w:shd w:fill="F2F5F9"/>
+            <w:tcMar>
+              <w:top w:w="120" w:type="dxa"/>
+              <w:left w:w="120" w:type="dxa"/>
+              <w:bottom w:w="120" w:type="dxa"/>
+              <w:right w:w="120" w:type="dxa"/>
+            </w:tcMar>
+          </w:tcPr>
+          <w:p>
+            <w:pPr>
+              <w:pStyle w:val="BodyText"/>
+              <w:spacing w:before="0" w:after="0"/>
+            </w:pPr>
+            <w:r>
+              <w:rPr>
+                <w:b/>
+                <w:color w:val="162033"/>
+                <w:sz w:val="20"/>
+                <w:szCs w:val="20"/>
+              </w:rPr>
+              <w:t xml:space="preserve">Grupo</w:t>
+            </w:r>
+          </w:p>
+        </w:tc>
+        <w:tc>
+          <w:tcPr>
+            <w:tcW w:w="2200" w:type="dxa"/>
+            <w:shd w:fill="F2F5F9"/>
+            <w:tcMar>
+              <w:top w:w="120" w:type="dxa"/>
+              <w:left w:w="120" w:type="dxa"/>
+              <w:bottom w:w="120" w:type="dxa"/>
+              <w:right w:w="120" w:type="dxa"/>
+            </w:tcMar>
+          </w:tcPr>
+          <w:p>
+            <w:pPr>
+              <w:pStyle w:val="BodyText"/>
+              <w:spacing w:before="0" w:after="0"/>
+            </w:pPr>
+            <w:r>
+              <w:rPr>
+                <w:b/>
+                <w:color w:val="162033"/>
+                <w:sz w:val="20"/>
+                <w:szCs w:val="20"/>
+              </w:rPr>
+              <w:t xml:space="preserve">Campos mínimos</w:t>
+            </w:r>
+          </w:p>
+        </w:tc>
+      </w:tr>
+      <w:tr>
+        <w:tc>
+          <w:tcPr>
+            <w:tcW w:w="2200" w:type="dxa"/>
+            <w:shd w:fill="F6FAFF"/>
+            <w:tcMar>
+              <w:top w:w="120" w:type="dxa"/>
+              <w:left w:w="120" w:type="dxa"/>
+              <w:bottom w:w="120" w:type="dxa"/>
+              <w:right w:w="120" w:type="dxa"/>
+            </w:tcMar>
+          </w:tcPr>
+          <w:p>
+            <w:pPr>
+              <w:pStyle w:val="BodyText"/>
+              <w:spacing w:before="0" w:after="0"/>
+            </w:pPr>
+            <w:r>
+              <w:rPr>
+                <w:color w:val="283342"/>
+                <w:sz w:val="19"/>
+                <w:szCs w:val="19"/>
+              </w:rPr>
+              <w:t xml:space="preserve">Accountability</w:t>
+            </w:r>
+          </w:p>
+        </w:tc>
+        <w:tc>
+          <w:tcPr>
+            <w:tcW w:w="2200" w:type="dxa"/>
+            <w:shd w:fill="FFF7ED"/>
+            <w:tcMar>
+              <w:top w:w="120" w:type="dxa"/>
+              <w:left w:w="120" w:type="dxa"/>
+              <w:bottom w:w="120" w:type="dxa"/>
+              <w:right w:w="120" w:type="dxa"/>
+            </w:tcMar>
+          </w:tcPr>
+          <w:p>
+            <w:pPr>
+              <w:pStyle w:val="BodyText"/>
+              <w:spacing w:before="0" w:after="0"/>
+            </w:pPr>
+            <w:r>
+              <w:rPr>
+                <w:color w:val="283342"/>
+                <w:sz w:val="19"/>
+                <w:szCs w:val="19"/>
+              </w:rPr>
+              <w:t xml:space="preserve">business_owner, technical_owner, support_group, data_steward, risk_owner</w:t>
+            </w:r>
+          </w:p>
+        </w:tc>
+      </w:tr>
+      <w:tr>
+        <w:tc>
+          <w:tcPr>
+            <w:tcW w:w="2200" w:type="dxa"/>
+            <w:shd w:fill="F6FAFF"/>
+            <w:tcMar>
+              <w:top w:w="120" w:type="dxa"/>
+              <w:left w:w="120" w:type="dxa"/>
+              <w:bottom w:w="120" w:type="dxa"/>
+              <w:right w:w="120" w:type="dxa"/>
+            </w:tcMar>
+          </w:tcPr>
+          <w:p>
+            <w:pPr>
+              <w:pStyle w:val="BodyText"/>
+              <w:spacing w:before="0" w:after="0"/>
+            </w:pPr>
+            <w:r>
+              <w:rPr>
+                <w:color w:val="283342"/>
+                <w:sz w:val="19"/>
+                <w:szCs w:val="19"/>
+              </w:rPr>
+              <w:t xml:space="preserve">Risco e dado</w:t>
+            </w:r>
+          </w:p>
+        </w:tc>
+        <w:tc>
+          <w:tcPr>
+            <w:tcW w:w="2200" w:type="dxa"/>
+            <w:shd w:fill="FFF7ED"/>
+            <w:tcMar>
+              <w:top w:w="120" w:type="dxa"/>
+              <w:left w:w="120" w:type="dxa"/>
+              <w:bottom w:w="120" w:type="dxa"/>
+              <w:right w:w="120" w:type="dxa"/>
+            </w:tcMar>
+          </w:tcPr>
+          <w:p>
+            <w:pPr>
+              <w:pStyle w:val="BodyText"/>
+              <w:spacing w:before="0" w:after="0"/>
+            </w:pPr>
+            <w:r>
+              <w:rPr>
+                <w:color w:val="283342"/>
+                <w:sz w:val="19"/>
+                <w:szCs w:val="19"/>
+              </w:rPr>
+              <w:t xml:space="preserve">risk_tier, data_classification, pii_handling, data_residency, decision_authority</w:t>
+            </w:r>
+          </w:p>
+        </w:tc>
+      </w:tr>
+      <w:tr>
+        <w:tc>
+          <w:tcPr>
+            <w:tcW w:w="2200" w:type="dxa"/>
+            <w:shd w:fill="F6FAFF"/>
+            <w:tcMar>
+              <w:top w:w="120" w:type="dxa"/>
+              <w:left w:w="120" w:type="dxa"/>
+              <w:bottom w:w="120" w:type="dxa"/>
+              <w:right w:w="120" w:type="dxa"/>
+            </w:tcMar>
+          </w:tcPr>
+          <w:p>
+            <w:pPr>
+              <w:pStyle w:val="BodyText"/>
+              <w:spacing w:before="0" w:after="0"/>
+            </w:pPr>
+            <w:r>
+              <w:rPr>
+                <w:color w:val="283342"/>
+                <w:sz w:val="19"/>
+                <w:szCs w:val="19"/>
+              </w:rPr>
+              <w:t xml:space="preserve">Runtime</w:t>
+            </w:r>
+          </w:p>
+        </w:tc>
+        <w:tc>
+          <w:tcPr>
+            <w:tcW w:w="2200" w:type="dxa"/>
+            <w:shd w:fill="FFF7ED"/>
+            <w:tcMar>
+              <w:top w:w="120" w:type="dxa"/>
+              <w:left w:w="120" w:type="dxa"/>
+              <w:bottom w:w="120" w:type="dxa"/>
+              <w:right w:w="120" w:type="dxa"/>
+            </w:tcMar>
+          </w:tcPr>
+          <w:p>
+            <w:pPr>
+              <w:pStyle w:val="BodyText"/>
+              <w:spacing w:before="0" w:after="0"/>
+            </w:pPr>
+            <w:r>
+              <w:rPr>
+                <w:color w:val="283342"/>
+                <w:sz w:val="19"/>
+                <w:szCs w:val="19"/>
+              </w:rPr>
+              <w:t xml:space="preserve">hosting_model, provider, environment, external_id, source_unique_id</w:t>
+            </w:r>
+          </w:p>
+        </w:tc>
+      </w:tr>
+      <w:tr>
+        <w:tc>
+          <w:tcPr>
+            <w:tcW w:w="2200" w:type="dxa"/>
+            <w:shd w:fill="F6FAFF"/>
+            <w:tcMar>
+              <w:top w:w="120" w:type="dxa"/>
+              <w:left w:w="120" w:type="dxa"/>
+              <w:bottom w:w="120" w:type="dxa"/>
+              <w:right w:w="120" w:type="dxa"/>
+            </w:tcMar>
+          </w:tcPr>
+          <w:p>
+            <w:pPr>
+              <w:pStyle w:val="BodyText"/>
+              <w:spacing w:before="0" w:after="0"/>
+            </w:pPr>
+            <w:r>
+              <w:rPr>
+                <w:color w:val="283342"/>
+                <w:sz w:val="19"/>
+                <w:szCs w:val="19"/>
+              </w:rPr>
+              <w:t xml:space="preserve">Governança</w:t>
+            </w:r>
+          </w:p>
+        </w:tc>
+        <w:tc>
+          <w:tcPr>
+            <w:tcW w:w="2200" w:type="dxa"/>
+            <w:shd w:fill="FFF7ED"/>
+            <w:tcMar>
+              <w:top w:w="120" w:type="dxa"/>
+              <w:left w:w="120" w:type="dxa"/>
+              <w:bottom w:w="120" w:type="dxa"/>
+              <w:right w:w="120" w:type="dxa"/>
+            </w:tcMar>
+          </w:tcPr>
+          <w:p>
+            <w:pPr>
+              <w:pStyle w:val="BodyText"/>
+              <w:spacing w:before="0" w:after="0"/>
+            </w:pPr>
+            <w:r>
+              <w:rPr>
+                <w:color w:val="283342"/>
+                <w:sz w:val="19"/>
+                <w:szCs w:val="19"/>
+              </w:rPr>
+              <w:t xml:space="preserve">review_cadence, kill_switch_owner, lifecycle, approval_state, evidence_url</w:t>
+            </w:r>
+          </w:p>
+        </w:tc>
+      </w:tr>
+      <w:tr>
+        <w:tc>
+          <w:tcPr>
+            <w:tcW w:w="2200" w:type="dxa"/>
+            <w:shd w:fill="F6FAFF"/>
+            <w:tcMar>
+              <w:top w:w="120" w:type="dxa"/>
+              <w:left w:w="120" w:type="dxa"/>
+              <w:bottom w:w="120" w:type="dxa"/>
+              <w:right w:w="120" w:type="dxa"/>
+            </w:tcMar>
+          </w:tcPr>
+          <w:p>
+            <w:pPr>
+              <w:pStyle w:val="BodyText"/>
+              <w:spacing w:before="0" w:after="0"/>
+            </w:pPr>
+            <w:r>
+              <w:rPr>
+                <w:color w:val="283342"/>
+                <w:sz w:val="19"/>
+                <w:szCs w:val="19"/>
+              </w:rPr>
+              <w:t xml:space="preserve">Relações</w:t>
+            </w:r>
+          </w:p>
+        </w:tc>
+        <w:tc>
+          <w:tcPr>
+            <w:tcW w:w="2200" w:type="dxa"/>
+            <w:shd w:fill="FFF7ED"/>
+            <w:tcMar>
+              <w:top w:w="120" w:type="dxa"/>
+              <w:left w:w="120" w:type="dxa"/>
+              <w:bottom w:w="120" w:type="dxa"/>
+              <w:right w:w="120" w:type="dxa"/>
+            </w:tcMar>
+          </w:tcPr>
+          <w:p>
+            <w:pPr>
+              <w:pStyle w:val="BodyText"/>
+              <w:spacing w:before="0" w:after="0"/>
+            </w:pPr>
+            <w:r>
+              <w:rPr>
+                <w:color w:val="283342"/>
+                <w:sz w:val="19"/>
+                <w:szCs w:val="19"/>
+              </w:rPr>
+              <w:t xml:space="preserve">cmdb_rel_asset_ci, Service Instance, Business Application, dependencies</w:t>
+            </w:r>
+          </w:p>
+        </w:tc>
+      </w:tr>
+    </w:tbl>
+    <w:p>
+      <w:r>
+        <w:br w:type="page"/>
+      </w:r>
+    </w:p>
+    <w:p>
+      <w:pPr>
+        <w:pStyle w:val="Heading1"/>
+        <w:spacing w:before="80" w:after="120"/>
+      </w:pPr>
+      <w:r>
+        <w:rPr>
+          <w:b/>
+          <w:color w:val="0A0F1C"/>
+          <w:sz w:val="34"/>
+          <w:szCs w:val="34"/>
+        </w:rPr>
+        <w:t xml:space="preserve">5. Architecture Sprint</w:t>
       </w:r>
     </w:p>
     <w:tbl>
@@ -2390,7 +3126,7 @@
           <w:sz w:val="34"/>
           <w:szCs w:val="34"/>
         </w:rPr>
-        <w:t xml:space="preserve">5. Fontes e Guardrails</w:t>
+        <w:t xml:space="preserve">6. Fontes e Guardrails</w:t>
       </w:r>
     </w:p>
     <w:p>

</xml_diff>